<commit_message>
Fix contribution files whitespace
</commit_message>
<xml_diff>
--- a/Data/Methods/Contributors_Methods_Data_website.docx
+++ b/Data/Methods/Contributors_Methods_Data_website.docx
@@ -1952,15 +1952,6 @@
         </w:rPr>
         <w:t xml:space="preserve"> Trust, Gates Foundation, and the Coalition for Epidemic Preparedness Innovations, European Union – Horizon Europe / EDCTP3 Joint Undertaking.</w:t>
       </w:r>
-    </w:p>
-    <w:p>
-      <w:pPr>
-        <w:rPr>
-          <w:rFonts w:ascii="Roboto" w:eastAsia="Roboto" w:hAnsi="Roboto" w:cs="Roboto"/>
-          <w:sz w:val="21"/>
-          <w:szCs w:val="21"/>
-        </w:rPr>
-      </w:pPr>
     </w:p>
     <w:p>
       <w:pPr>

</xml_diff>